<commit_message>
Update church certificate with exact Pfarramt logo
Recreated the two overlapping book shapes (dark navy + light blue) with
white cross from the official Prot. Pfarramt Gimmeldingen-Königsbach-Mußbach
logo. Updated organization name throughout the document.

https://claude.ai/code/session_013UrfYQBJ1bwCzEQMdy9J8M
</commit_message>
<xml_diff>
--- a/kirchenbescheinigung-stefanou.docx
+++ b/kirchenbescheinigung-stefanou.docx
@@ -10,7 +10,7 @@
       <w:r>
         <w:drawing>
           <wp:inline xmlns:a="http://schemas.openxmlformats.org/drawingml/2006/main" xmlns:pic="http://schemas.openxmlformats.org/drawingml/2006/picture">
-            <wp:extent cx="4680000" cy="1872000"/>
+            <wp:extent cx="4860000" cy="1005517"/>
             <wp:docPr id="1" name="Picture 1"/>
             <wp:cNvGraphicFramePr>
               <a:graphicFrameLocks noChangeAspect="1"/>
@@ -31,7 +31,7 @@
                   <pic:spPr>
                     <a:xfrm>
                       <a:off x="0" y="0"/>
-                      <a:ext cx="4680000" cy="1872000"/>
+                      <a:ext cx="4860000" cy="1005517"/>
                     </a:xfrm>
                     <a:prstGeom prst="rect"/>
                   </pic:spPr>
@@ -46,7 +46,7 @@
       <w:pPr>
         <w:spacing w:before="0" w:after="200"/>
         <w:pBdr>
-          <w:bottom w:val="single" w:sz="12" w:space="1" w:color="8C1414"/>
+          <w:bottom w:val="single" w:sz="12" w:space="1" w:color="1A376D"/>
         </w:pBdr>
       </w:pPr>
     </w:p>
@@ -76,7 +76,7 @@
           <w:rFonts w:ascii="Times New Roman" w:hAnsi="Times New Roman"/>
           <w:b/>
           <w:i w:val="0"/>
-          <w:color w:val="8C1414"/>
+          <w:color w:val="1A376D"/>
           <w:sz w:val="26"/>
           <w:u w:val="single"/>
         </w:rPr>
@@ -109,7 +109,7 @@
           <w:rFonts w:ascii="Times New Roman" w:hAnsi="Times New Roman"/>
           <w:b/>
           <w:i w:val="0"/>
-          <w:color w:val="8C1414"/>
+          <w:color w:val="1A376D"/>
           <w:sz w:val="28"/>
         </w:rPr>
         <w:t>David Stefanou</w:t>
@@ -153,7 +153,7 @@
           <w:i w:val="0"/>
           <w:sz w:val="24"/>
         </w:rPr>
-        <w:t>Protestantische Kirchengemeinde Gimmeldingen-Königsbach</w:t>
+        <w:t>Prot. Pfarramt Gimmeldingen-Königsbach-Mußbach</w:t>
       </w:r>
       <w:r>
         <w:rPr>
@@ -178,7 +178,7 @@
           <w:sz w:val="24"/>
           <w:u w:val="none"/>
         </w:rPr>
-        <w:t>Sein Engagement ist ein wertvoller Beitrag zum Leben unserer Gemeinde. Wir sind dankbar für seine verlässliche Mitarbeit und sein Engagement.</w:t>
+        <w:t>Sein Engagement ist ein wertvoller Beitrag zum Leben unserer Gemeinde. Wir sind dankbar für seine verlässliche Mitarbeit und sein Einsatz.</w:t>
       </w:r>
     </w:p>
     <w:p>
@@ -277,15 +277,15 @@
           <w:sz w:val="22"/>
           <w:u w:val="none"/>
         </w:rPr>
-        <w:t>Protestantische Kirchengemeinde Gimmeldingen-Königsbach</w:t>
+        <w:t>Prot. Pfarramt Gimmeldingen-Königsbach-Mußbach</w:t>
       </w:r>
     </w:p>
     <w:p>
       <w:pPr>
+        <w:spacing w:before="400" w:after="40"/>
         <w:pBdr>
-          <w:top w:val="single" w:sz="6" w:space="1" w:color="8C1414"/>
+          <w:top w:val="single" w:sz="6" w:space="1" w:color="1A376D"/>
         </w:pBdr>
-        <w:spacing w:before="400"/>
         <w:jc w:val="center"/>
       </w:pPr>
       <w:r>
@@ -294,7 +294,7 @@
           <w:color w:val="646464"/>
           <w:sz w:val="16"/>
         </w:rPr>
-        <w:t>Protestantische Kirchengemeinde Gimmeldingen-Königsbach  ·  Kirchplatz 2, 67435 Neustadt a.d. Weinstraße  ·  Tel. 06321/68655  ·  pfarramt.gimmeldingen@evkirchepfalz.de</w:t>
+        <w:t>Prot. Pfarramt Gimmeldingen-Königsbach-Mußbach  ·  Kirchplatz 2, 67435 Neustadt a.d. Weinstraße  ·  Tel. 06321/68655  ·  pfarramt.gimmeldingen@evkirchepfalz.de</w:t>
       </w:r>
     </w:p>
     <w:sectPr>

</xml_diff>